<commit_message>
feat(ui): refactor customers page with api layer and edit/delete
</commit_message>
<xml_diff>
--- a/docs/TempNotes/Notes-General.docx
+++ b/docs/TempNotes/Notes-General.docx
@@ -638,10 +638,156 @@
     <w:p>
       <w:pPr>
         <w:spacing w:before="100" w:beforeAutospacing="1" w:after="100" w:afterAutospacing="1" w:line="240" w:lineRule="auto"/>
-      </w:pPr>
-    </w:p>
-    <w:p>
-      <w:r>
+        <w:rPr>
+          <w:rFonts w:ascii="Times New Roman" w:eastAsia="Times New Roman" w:hAnsi="Times New Roman" w:cs="Times New Roman"/>
+          <w:sz w:val="24"/>
+          <w:szCs w:val="24"/>
+        </w:rPr>
+      </w:pPr>
+    </w:p>
+    <w:p>
+      <w:pPr>
+        <w:pStyle w:val="Heading1"/>
+      </w:pPr>
+      <w:proofErr w:type="spellStart"/>
+      <w:r>
+        <w:t>useState</w:t>
+      </w:r>
+      <w:proofErr w:type="spellEnd"/>
+      <w:r>
+        <w:t xml:space="preserve"> vs </w:t>
+      </w:r>
+      <w:proofErr w:type="spellStart"/>
+      <w:r>
+        <w:t>useEffect</w:t>
+      </w:r>
+      <w:proofErr w:type="spellEnd"/>
+    </w:p>
+    <w:p>
+      <w:pPr>
+        <w:pStyle w:val="NormalWeb"/>
+      </w:pPr>
+      <w:r>
+        <w:t xml:space="preserve">Use </w:t>
+      </w:r>
+      <w:proofErr w:type="spellStart"/>
+      <w:r>
+        <w:rPr>
+          <w:rStyle w:val="HTMLCode"/>
+        </w:rPr>
+        <w:t>useState</w:t>
+      </w:r>
+      <w:proofErr w:type="spellEnd"/>
+      <w:r>
+        <w:t xml:space="preserve"> when:</w:t>
+      </w:r>
+    </w:p>
+    <w:p>
+      <w:pPr>
+        <w:pStyle w:val="NormalWeb"/>
+        <w:numPr>
+          <w:ilvl w:val="0"/>
+          <w:numId w:val="8"/>
+        </w:numPr>
+      </w:pPr>
+      <w:r>
+        <w:t>UI must re-render when a value changes.</w:t>
+      </w:r>
+    </w:p>
+    <w:p>
+      <w:pPr>
+        <w:pStyle w:val="NormalWeb"/>
+      </w:pPr>
+      <w:r>
+        <w:t xml:space="preserve">Use </w:t>
+      </w:r>
+      <w:proofErr w:type="spellStart"/>
+      <w:r>
+        <w:rPr>
+          <w:rStyle w:val="HTMLCode"/>
+        </w:rPr>
+        <w:t>useEffect</w:t>
+      </w:r>
+      <w:proofErr w:type="spellEnd"/>
+      <w:r>
+        <w:t xml:space="preserve"> when:</w:t>
+      </w:r>
+    </w:p>
+    <w:p>
+      <w:pPr>
+        <w:pStyle w:val="NormalWeb"/>
+        <w:numPr>
+          <w:ilvl w:val="0"/>
+          <w:numId w:val="9"/>
+        </w:numPr>
+      </w:pPr>
+      <w:r>
+        <w:t xml:space="preserve">you need to do something </w:t>
+      </w:r>
+      <w:r>
+        <w:rPr>
+          <w:rStyle w:val="Strong"/>
+        </w:rPr>
+        <w:t>because</w:t>
+      </w:r>
+      <w:r>
+        <w:t xml:space="preserve"> of render/lifecycle or a state change:</w:t>
+      </w:r>
+    </w:p>
+    <w:p>
+      <w:pPr>
+        <w:pStyle w:val="NormalWeb"/>
+        <w:numPr>
+          <w:ilvl w:val="1"/>
+          <w:numId w:val="9"/>
+        </w:numPr>
+      </w:pPr>
+      <w:r>
+        <w:t>initial data load</w:t>
+      </w:r>
+    </w:p>
+    <w:p>
+      <w:pPr>
+        <w:pStyle w:val="NormalWeb"/>
+        <w:numPr>
+          <w:ilvl w:val="1"/>
+          <w:numId w:val="9"/>
+        </w:numPr>
+      </w:pPr>
+      <w:r>
+        <w:t>re-fetch when filter changes</w:t>
+      </w:r>
+    </w:p>
+    <w:p>
+      <w:pPr>
+        <w:pStyle w:val="NormalWeb"/>
+        <w:numPr>
+          <w:ilvl w:val="1"/>
+          <w:numId w:val="9"/>
+        </w:numPr>
+      </w:pPr>
+      <w:r>
+        <w:t>subscribe/unsubscribe</w:t>
+      </w:r>
+    </w:p>
+    <w:p>
+      <w:pPr>
+        <w:spacing w:before="100" w:beforeAutospacing="1" w:after="100" w:afterAutospacing="1" w:line="240" w:lineRule="auto"/>
+        <w:rPr>
+          <w:rFonts w:ascii="Times New Roman" w:eastAsia="Times New Roman" w:hAnsi="Times New Roman" w:cs="Times New Roman"/>
+          <w:sz w:val="24"/>
+          <w:szCs w:val="24"/>
+        </w:rPr>
+      </w:pPr>
+    </w:p>
+    <w:p>
+      <w:pPr>
+        <w:spacing w:before="100" w:beforeAutospacing="1" w:after="100" w:afterAutospacing="1" w:line="240" w:lineRule="auto"/>
+      </w:pPr>
+    </w:p>
+    <w:p>
+      <w:r>
+        <w:lastRenderedPageBreak/>
         <w:br w:type="page"/>
       </w:r>
     </w:p>
@@ -1255,13 +1401,7 @@
       </w:r>
       <w:proofErr w:type="spellEnd"/>
       <w:r>
-        <w:t xml:space="preserve"> in C#).</w:t>
-      </w:r>
-      <w:r>
-        <w:t xml:space="preserve"> </w:t>
-      </w:r>
-      <w:r>
-        <w:t xml:space="preserve">We are telling TypeScript: “Trust me, this element is not null and is an </w:t>
+        <w:t xml:space="preserve"> in C#). We are telling TypeScript: “Trust me, this element is not null and is an </w:t>
       </w:r>
       <w:proofErr w:type="spellStart"/>
       <w:r>
@@ -1309,10 +1449,7 @@
         <w:pStyle w:val="Heading1"/>
       </w:pPr>
       <w:r>
-        <w:t xml:space="preserve">C# to React analogy. </w:t>
-      </w:r>
-      <w:r>
-        <w:t>Big-picture analogy for you as a C# dev</w:t>
+        <w:t>C# to React analogy. Big-picture analogy for you as a C# dev</w:t>
       </w:r>
     </w:p>
     <w:p>
@@ -1511,6 +1648,155 @@
 <file path=word/numbering.xml><?xml version="1.0" encoding="utf-8"?>
 <w:numbering xmlns:wpc="http://schemas.microsoft.com/office/word/2010/wordprocessingCanvas" xmlns:cx="http://schemas.microsoft.com/office/drawing/2014/chartex" xmlns:cx1="http://schemas.microsoft.com/office/drawing/2015/9/8/chartex" xmlns:cx2="http://schemas.microsoft.com/office/drawing/2015/10/21/chartex" xmlns:cx3="http://schemas.microsoft.com/office/drawing/2016/5/9/chartex" xmlns:cx4="http://schemas.microsoft.com/office/drawing/2016/5/10/chartex" xmlns:cx5="http://schemas.microsoft.com/office/drawing/2016/5/11/chartex" xmlns:cx6="http://schemas.microsoft.com/office/drawing/2016/5/12/chartex" xmlns:cx7="http://schemas.microsoft.com/office/drawing/2016/5/13/chartex" xmlns:cx8="http://schemas.microsoft.com/office/drawing/2016/5/14/chartex" xmlns:mc="http://schemas.openxmlformats.org/markup-compatibility/2006" xmlns:aink="http://schemas.microsoft.com/office/drawing/2016/ink" xmlns:am3d="http://schemas.microsoft.com/office/drawing/2017/model3d" xmlns:o="urn:schemas-microsoft-com:office:office" xmlns:r="http://schemas.openxmlformats.org/officeDocument/2006/relationships" xmlns:m="http://schemas.openxmlformats.org/officeDocument/2006/math" xmlns:v="urn:schemas-microsoft-com:vml" xmlns:wp14="http://schemas.microsoft.com/office/word/2010/wordprocessingDrawing" xmlns:wp="http://schemas.openxmlformats.org/drawingml/2006/wordprocessingDrawing" xmlns:w10="urn:schemas-microsoft-com:office:word" xmlns:w="http://schemas.openxmlformats.org/wordprocessingml/2006/main" xmlns:w14="http://schemas.microsoft.com/office/word/2010/wordml" xmlns:w15="http://schemas.microsoft.com/office/word/2012/wordml" xmlns:w16cex="http://schemas.microsoft.com/office/word/2018/wordml/cex" xmlns:w16cid="http://schemas.microsoft.com/office/word/2016/wordml/cid" xmlns:w16="http://schemas.microsoft.com/office/word/2018/wordml" xmlns:w16sdtdh="http://schemas.microsoft.com/office/word/2020/wordml/sdtdatahash" xmlns:w16se="http://schemas.microsoft.com/office/word/2015/wordml/symex" xmlns:wpg="http://schemas.microsoft.com/office/word/2010/wordprocessingGroup" xmlns:wpi="http://schemas.microsoft.com/office/word/2010/wordprocessingInk" xmlns:wne="http://schemas.microsoft.com/office/word/2006/wordml" xmlns:wps="http://schemas.microsoft.com/office/word/2010/wordprocessingShape" mc:Ignorable="w14 w15 w16se w16cid w16 w16cex w16sdtdh wp14">
   <w:abstractNum w:abstractNumId="0" w15:restartNumberingAfterBreak="0">
+    <w:nsid w:val="102A42DE"/>
+    <w:multiLevelType w:val="multilevel"/>
+    <w:tmpl w:val="EF96DE6A"/>
+    <w:lvl w:ilvl="0">
+      <w:start w:val="1"/>
+      <w:numFmt w:val="bullet"/>
+      <w:lvlText w:val=""/>
+      <w:lvlJc w:val="left"/>
+      <w:pPr>
+        <w:tabs>
+          <w:tab w:val="num" w:pos="720"/>
+        </w:tabs>
+        <w:ind w:left="720" w:hanging="360"/>
+      </w:pPr>
+      <w:rPr>
+        <w:rFonts w:ascii="Symbol" w:hAnsi="Symbol" w:hint="default"/>
+        <w:sz w:val="20"/>
+      </w:rPr>
+    </w:lvl>
+    <w:lvl w:ilvl="1">
+      <w:start w:val="1"/>
+      <w:numFmt w:val="bullet"/>
+      <w:lvlText w:val="o"/>
+      <w:lvlJc w:val="left"/>
+      <w:pPr>
+        <w:tabs>
+          <w:tab w:val="num" w:pos="1440"/>
+        </w:tabs>
+        <w:ind w:left="1440" w:hanging="360"/>
+      </w:pPr>
+      <w:rPr>
+        <w:rFonts w:ascii="Courier New" w:hAnsi="Courier New" w:hint="default"/>
+        <w:sz w:val="20"/>
+      </w:rPr>
+    </w:lvl>
+    <w:lvl w:ilvl="2" w:tentative="1">
+      <w:start w:val="1"/>
+      <w:numFmt w:val="bullet"/>
+      <w:lvlText w:val=""/>
+      <w:lvlJc w:val="left"/>
+      <w:pPr>
+        <w:tabs>
+          <w:tab w:val="num" w:pos="2160"/>
+        </w:tabs>
+        <w:ind w:left="2160" w:hanging="360"/>
+      </w:pPr>
+      <w:rPr>
+        <w:rFonts w:ascii="Wingdings" w:hAnsi="Wingdings" w:hint="default"/>
+        <w:sz w:val="20"/>
+      </w:rPr>
+    </w:lvl>
+    <w:lvl w:ilvl="3" w:tentative="1">
+      <w:start w:val="1"/>
+      <w:numFmt w:val="bullet"/>
+      <w:lvlText w:val=""/>
+      <w:lvlJc w:val="left"/>
+      <w:pPr>
+        <w:tabs>
+          <w:tab w:val="num" w:pos="2880"/>
+        </w:tabs>
+        <w:ind w:left="2880" w:hanging="360"/>
+      </w:pPr>
+      <w:rPr>
+        <w:rFonts w:ascii="Wingdings" w:hAnsi="Wingdings" w:hint="default"/>
+        <w:sz w:val="20"/>
+      </w:rPr>
+    </w:lvl>
+    <w:lvl w:ilvl="4" w:tentative="1">
+      <w:start w:val="1"/>
+      <w:numFmt w:val="bullet"/>
+      <w:lvlText w:val=""/>
+      <w:lvlJc w:val="left"/>
+      <w:pPr>
+        <w:tabs>
+          <w:tab w:val="num" w:pos="3600"/>
+        </w:tabs>
+        <w:ind w:left="3600" w:hanging="360"/>
+      </w:pPr>
+      <w:rPr>
+        <w:rFonts w:ascii="Wingdings" w:hAnsi="Wingdings" w:hint="default"/>
+        <w:sz w:val="20"/>
+      </w:rPr>
+    </w:lvl>
+    <w:lvl w:ilvl="5" w:tentative="1">
+      <w:start w:val="1"/>
+      <w:numFmt w:val="bullet"/>
+      <w:lvlText w:val=""/>
+      <w:lvlJc w:val="left"/>
+      <w:pPr>
+        <w:tabs>
+          <w:tab w:val="num" w:pos="4320"/>
+        </w:tabs>
+        <w:ind w:left="4320" w:hanging="360"/>
+      </w:pPr>
+      <w:rPr>
+        <w:rFonts w:ascii="Wingdings" w:hAnsi="Wingdings" w:hint="default"/>
+        <w:sz w:val="20"/>
+      </w:rPr>
+    </w:lvl>
+    <w:lvl w:ilvl="6" w:tentative="1">
+      <w:start w:val="1"/>
+      <w:numFmt w:val="bullet"/>
+      <w:lvlText w:val=""/>
+      <w:lvlJc w:val="left"/>
+      <w:pPr>
+        <w:tabs>
+          <w:tab w:val="num" w:pos="5040"/>
+        </w:tabs>
+        <w:ind w:left="5040" w:hanging="360"/>
+      </w:pPr>
+      <w:rPr>
+        <w:rFonts w:ascii="Wingdings" w:hAnsi="Wingdings" w:hint="default"/>
+        <w:sz w:val="20"/>
+      </w:rPr>
+    </w:lvl>
+    <w:lvl w:ilvl="7" w:tentative="1">
+      <w:start w:val="1"/>
+      <w:numFmt w:val="bullet"/>
+      <w:lvlText w:val=""/>
+      <w:lvlJc w:val="left"/>
+      <w:pPr>
+        <w:tabs>
+          <w:tab w:val="num" w:pos="5760"/>
+        </w:tabs>
+        <w:ind w:left="5760" w:hanging="360"/>
+      </w:pPr>
+      <w:rPr>
+        <w:rFonts w:ascii="Wingdings" w:hAnsi="Wingdings" w:hint="default"/>
+        <w:sz w:val="20"/>
+      </w:rPr>
+    </w:lvl>
+    <w:lvl w:ilvl="8" w:tentative="1">
+      <w:start w:val="1"/>
+      <w:numFmt w:val="bullet"/>
+      <w:lvlText w:val=""/>
+      <w:lvlJc w:val="left"/>
+      <w:pPr>
+        <w:tabs>
+          <w:tab w:val="num" w:pos="6480"/>
+        </w:tabs>
+        <w:ind w:left="6480" w:hanging="360"/>
+      </w:pPr>
+      <w:rPr>
+        <w:rFonts w:ascii="Wingdings" w:hAnsi="Wingdings" w:hint="default"/>
+        <w:sz w:val="20"/>
+      </w:rPr>
+    </w:lvl>
+  </w:abstractNum>
+  <w:abstractNum w:abstractNumId="1" w15:restartNumberingAfterBreak="0">
     <w:nsid w:val="1FAA0046"/>
     <w:multiLevelType w:val="hybridMultilevel"/>
     <w:tmpl w:val="6D221B24"/>
@@ -1623,7 +1909,7 @@
       </w:rPr>
     </w:lvl>
   </w:abstractNum>
-  <w:abstractNum w:abstractNumId="1" w15:restartNumberingAfterBreak="0">
+  <w:abstractNum w:abstractNumId="2" w15:restartNumberingAfterBreak="0">
     <w:nsid w:val="292F37CF"/>
     <w:multiLevelType w:val="hybridMultilevel"/>
     <w:tmpl w:val="010EB5F4"/>
@@ -1736,7 +2022,156 @@
       </w:rPr>
     </w:lvl>
   </w:abstractNum>
-  <w:abstractNum w:abstractNumId="2" w15:restartNumberingAfterBreak="0">
+  <w:abstractNum w:abstractNumId="3" w15:restartNumberingAfterBreak="0">
+    <w:nsid w:val="2CEB5D07"/>
+    <w:multiLevelType w:val="multilevel"/>
+    <w:tmpl w:val="35207A94"/>
+    <w:lvl w:ilvl="0">
+      <w:start w:val="1"/>
+      <w:numFmt w:val="bullet"/>
+      <w:lvlText w:val=""/>
+      <w:lvlJc w:val="left"/>
+      <w:pPr>
+        <w:tabs>
+          <w:tab w:val="num" w:pos="720"/>
+        </w:tabs>
+        <w:ind w:left="720" w:hanging="360"/>
+      </w:pPr>
+      <w:rPr>
+        <w:rFonts w:ascii="Symbol" w:hAnsi="Symbol" w:hint="default"/>
+        <w:sz w:val="20"/>
+      </w:rPr>
+    </w:lvl>
+    <w:lvl w:ilvl="1" w:tentative="1">
+      <w:start w:val="1"/>
+      <w:numFmt w:val="bullet"/>
+      <w:lvlText w:val="o"/>
+      <w:lvlJc w:val="left"/>
+      <w:pPr>
+        <w:tabs>
+          <w:tab w:val="num" w:pos="1440"/>
+        </w:tabs>
+        <w:ind w:left="1440" w:hanging="360"/>
+      </w:pPr>
+      <w:rPr>
+        <w:rFonts w:ascii="Courier New" w:hAnsi="Courier New" w:hint="default"/>
+        <w:sz w:val="20"/>
+      </w:rPr>
+    </w:lvl>
+    <w:lvl w:ilvl="2" w:tentative="1">
+      <w:start w:val="1"/>
+      <w:numFmt w:val="bullet"/>
+      <w:lvlText w:val=""/>
+      <w:lvlJc w:val="left"/>
+      <w:pPr>
+        <w:tabs>
+          <w:tab w:val="num" w:pos="2160"/>
+        </w:tabs>
+        <w:ind w:left="2160" w:hanging="360"/>
+      </w:pPr>
+      <w:rPr>
+        <w:rFonts w:ascii="Wingdings" w:hAnsi="Wingdings" w:hint="default"/>
+        <w:sz w:val="20"/>
+      </w:rPr>
+    </w:lvl>
+    <w:lvl w:ilvl="3" w:tentative="1">
+      <w:start w:val="1"/>
+      <w:numFmt w:val="bullet"/>
+      <w:lvlText w:val=""/>
+      <w:lvlJc w:val="left"/>
+      <w:pPr>
+        <w:tabs>
+          <w:tab w:val="num" w:pos="2880"/>
+        </w:tabs>
+        <w:ind w:left="2880" w:hanging="360"/>
+      </w:pPr>
+      <w:rPr>
+        <w:rFonts w:ascii="Wingdings" w:hAnsi="Wingdings" w:hint="default"/>
+        <w:sz w:val="20"/>
+      </w:rPr>
+    </w:lvl>
+    <w:lvl w:ilvl="4" w:tentative="1">
+      <w:start w:val="1"/>
+      <w:numFmt w:val="bullet"/>
+      <w:lvlText w:val=""/>
+      <w:lvlJc w:val="left"/>
+      <w:pPr>
+        <w:tabs>
+          <w:tab w:val="num" w:pos="3600"/>
+        </w:tabs>
+        <w:ind w:left="3600" w:hanging="360"/>
+      </w:pPr>
+      <w:rPr>
+        <w:rFonts w:ascii="Wingdings" w:hAnsi="Wingdings" w:hint="default"/>
+        <w:sz w:val="20"/>
+      </w:rPr>
+    </w:lvl>
+    <w:lvl w:ilvl="5" w:tentative="1">
+      <w:start w:val="1"/>
+      <w:numFmt w:val="bullet"/>
+      <w:lvlText w:val=""/>
+      <w:lvlJc w:val="left"/>
+      <w:pPr>
+        <w:tabs>
+          <w:tab w:val="num" w:pos="4320"/>
+        </w:tabs>
+        <w:ind w:left="4320" w:hanging="360"/>
+      </w:pPr>
+      <w:rPr>
+        <w:rFonts w:ascii="Wingdings" w:hAnsi="Wingdings" w:hint="default"/>
+        <w:sz w:val="20"/>
+      </w:rPr>
+    </w:lvl>
+    <w:lvl w:ilvl="6" w:tentative="1">
+      <w:start w:val="1"/>
+      <w:numFmt w:val="bullet"/>
+      <w:lvlText w:val=""/>
+      <w:lvlJc w:val="left"/>
+      <w:pPr>
+        <w:tabs>
+          <w:tab w:val="num" w:pos="5040"/>
+        </w:tabs>
+        <w:ind w:left="5040" w:hanging="360"/>
+      </w:pPr>
+      <w:rPr>
+        <w:rFonts w:ascii="Wingdings" w:hAnsi="Wingdings" w:hint="default"/>
+        <w:sz w:val="20"/>
+      </w:rPr>
+    </w:lvl>
+    <w:lvl w:ilvl="7" w:tentative="1">
+      <w:start w:val="1"/>
+      <w:numFmt w:val="bullet"/>
+      <w:lvlText w:val=""/>
+      <w:lvlJc w:val="left"/>
+      <w:pPr>
+        <w:tabs>
+          <w:tab w:val="num" w:pos="5760"/>
+        </w:tabs>
+        <w:ind w:left="5760" w:hanging="360"/>
+      </w:pPr>
+      <w:rPr>
+        <w:rFonts w:ascii="Wingdings" w:hAnsi="Wingdings" w:hint="default"/>
+        <w:sz w:val="20"/>
+      </w:rPr>
+    </w:lvl>
+    <w:lvl w:ilvl="8" w:tentative="1">
+      <w:start w:val="1"/>
+      <w:numFmt w:val="bullet"/>
+      <w:lvlText w:val=""/>
+      <w:lvlJc w:val="left"/>
+      <w:pPr>
+        <w:tabs>
+          <w:tab w:val="num" w:pos="6480"/>
+        </w:tabs>
+        <w:ind w:left="6480" w:hanging="360"/>
+      </w:pPr>
+      <w:rPr>
+        <w:rFonts w:ascii="Wingdings" w:hAnsi="Wingdings" w:hint="default"/>
+        <w:sz w:val="20"/>
+      </w:rPr>
+    </w:lvl>
+  </w:abstractNum>
+  <w:abstractNum w:abstractNumId="4" w15:restartNumberingAfterBreak="0">
     <w:nsid w:val="35651430"/>
     <w:multiLevelType w:val="multilevel"/>
     <w:tmpl w:val="3FC03B64"/>
@@ -1885,7 +2320,7 @@
       </w:rPr>
     </w:lvl>
   </w:abstractNum>
-  <w:abstractNum w:abstractNumId="3" w15:restartNumberingAfterBreak="0">
+  <w:abstractNum w:abstractNumId="5" w15:restartNumberingAfterBreak="0">
     <w:nsid w:val="3B173006"/>
     <w:multiLevelType w:val="multilevel"/>
     <w:tmpl w:val="155CCA00"/>
@@ -2034,7 +2469,7 @@
       </w:rPr>
     </w:lvl>
   </w:abstractNum>
-  <w:abstractNum w:abstractNumId="4" w15:restartNumberingAfterBreak="0">
+  <w:abstractNum w:abstractNumId="6" w15:restartNumberingAfterBreak="0">
     <w:nsid w:val="64B70842"/>
     <w:multiLevelType w:val="hybridMultilevel"/>
     <w:tmpl w:val="E6560AB4"/>
@@ -2147,7 +2582,7 @@
       </w:rPr>
     </w:lvl>
   </w:abstractNum>
-  <w:abstractNum w:abstractNumId="5" w15:restartNumberingAfterBreak="0">
+  <w:abstractNum w:abstractNumId="7" w15:restartNumberingAfterBreak="0">
     <w:nsid w:val="78D26798"/>
     <w:multiLevelType w:val="multilevel"/>
     <w:tmpl w:val="EEE8D8EC"/>
@@ -2296,7 +2731,7 @@
       </w:rPr>
     </w:lvl>
   </w:abstractNum>
-  <w:abstractNum w:abstractNumId="6" w15:restartNumberingAfterBreak="0">
+  <w:abstractNum w:abstractNumId="8" w15:restartNumberingAfterBreak="0">
     <w:nsid w:val="7B3A3350"/>
     <w:multiLevelType w:val="hybridMultilevel"/>
     <w:tmpl w:val="A06A9590"/>
@@ -2410,25 +2845,31 @@
     </w:lvl>
   </w:abstractNum>
   <w:num w:numId="1">
+    <w:abstractNumId w:val="7"/>
+  </w:num>
+  <w:num w:numId="2">
+    <w:abstractNumId w:val="4"/>
+  </w:num>
+  <w:num w:numId="3">
+    <w:abstractNumId w:val="1"/>
+  </w:num>
+  <w:num w:numId="4">
+    <w:abstractNumId w:val="8"/>
+  </w:num>
+  <w:num w:numId="5">
+    <w:abstractNumId w:val="2"/>
+  </w:num>
+  <w:num w:numId="6">
+    <w:abstractNumId w:val="6"/>
+  </w:num>
+  <w:num w:numId="7">
     <w:abstractNumId w:val="5"/>
   </w:num>
-  <w:num w:numId="2">
-    <w:abstractNumId w:val="2"/>
+  <w:num w:numId="8">
+    <w:abstractNumId w:val="3"/>
   </w:num>
-  <w:num w:numId="3">
+  <w:num w:numId="9">
     <w:abstractNumId w:val="0"/>
-  </w:num>
-  <w:num w:numId="4">
-    <w:abstractNumId w:val="6"/>
-  </w:num>
-  <w:num w:numId="5">
-    <w:abstractNumId w:val="1"/>
-  </w:num>
-  <w:num w:numId="6">
-    <w:abstractNumId w:val="4"/>
-  </w:num>
-  <w:num w:numId="7">
-    <w:abstractNumId w:val="3"/>
   </w:num>
 </w:numbering>
 </file>
@@ -2875,6 +3316,7 @@
   <w:style w:type="character" w:default="1" w:styleId="DefaultParagraphFont">
     <w:name w:val="Default Paragraph Font"/>
     <w:uiPriority w:val="1"/>
+    <w:semiHidden/>
     <w:unhideWhenUsed/>
   </w:style>
   <w:style w:type="table" w:default="1" w:styleId="TableNormal">

</xml_diff>